<commit_message>
Brief voice: neutral, distribution-list publication (not addressed to Matthew)
Recast the brief from a personal letter into a neutral third-party
publication for a distribution list:
- CLAUDE.md: add an 'Audience and voice' rule to 'How briefs should read'.
- topics/ai-pulse.md: neutral intro opener; rename beats 'Why it matters
  to me, traced out' -> 'Why it matters' and 'My read' -> 'The take'.
- templates/ai-pulse-format-reference.(md|docx): neutralize the exemplar
  to match (drop the 'Matthew,' opener and first/second-person voice).
- MEMORY.md: record the new voice rule and beat labels.

Co-Authored-By: Claude Opus 4.8 <noreply@anthropic.com>
Claude-Session: https://claude.ai/code/session_01BdkwahKEQkSri93kBHfX4o
</commit_message>
<xml_diff>
--- a/templates/ai-pulse-format-reference.docx
+++ b/templates/ai-pulse-format-reference.docx
@@ -20,7 +20,7 @@
     </w:p>
     <w:p>
       <w:r>
-        <w:t>Matthew, this was a loud week, and the through-line is competition reordering the board. The cozy "two-horse race" between OpenAI and Anthropic, with Google as the asterisk, is breaking apart on three fronts at once: a Chinese open-weight model finally stuck the landing, Google started bleeding its most famous scientists, and Microsoft's CEO published a manifesto arguing the model you pick barely matters at all. Underneath it runs the same export-control fight that has dominated June, now inching toward a truce. A few supporting threads (GLM's release, the SpaceX–Cursor deal, the Nadella essay's posting) originate just before this window; I've flagged those as running context, not fresh news.</w:t>
+        <w:t>This was a loud week, and the through-line is competition reordering the board. The cozy "two-horse race" between OpenAI and Anthropic, with Google as the asterisk, is breaking apart on three fronts at once: a Chinese open-weight model finally stuck the landing, Google started bleeding its most famous scientists, and Microsoft's CEO published a manifesto arguing the model a buyer picks barely matters at all. Underneath it runs the same export-control fight that has dominated June, now inching toward a truce. A few supporting threads (GLM's release, the SpaceX–Cursor deal, the Nadella essay's posting) originate just before this window; those are flagged as running context, not fresh news.</w:t>
       </w:r>
     </w:p>
     <w:p>
@@ -66,7 +66,7 @@
         <w:rPr>
           <w:b/>
         </w:rPr>
-        <w:t>Why it matters to me, traced out.</w:t>
+        <w:t>Why it matters.</w:t>
       </w:r>
     </w:p>
     <w:p>
@@ -116,7 +116,7 @@
         <w:rPr>
           <w:b/>
         </w:rPr>
-        <w:t>My read.</w:t>
+        <w:t>The take.</w:t>
       </w:r>
       <w:r>
         <w:t xml:space="preserve"> This is the most important model story of the week, and the signal is real rather than hype — the staying power past the usual two-week fade is exactly what's new. The operator move is not to panic-buy the ~$400K of Nvidia H200s needed to run it locally; it's to give one corner of the org a sandbox and a router (like OpenRouter) and build the routing muscle, because that muscle is the durable skill no matter which model wins.</w:t>
@@ -214,7 +214,7 @@
         <w:rPr>
           <w:b/>
         </w:rPr>
-        <w:t>Why it matters to me, traced out.</w:t>
+        <w:t>Why it matters.</w:t>
       </w:r>
     </w:p>
     <w:p>
@@ -250,10 +250,10 @@
         <w:rPr>
           <w:b/>
         </w:rPr>
-        <w:t>My read.</w:t>
+        <w:t>The take.</w:t>
       </w:r>
       <w:r>
-        <w:t xml:space="preserve"> Weigh this as a genuine narrative shift, not a verdict. The honest counter, which I'd hold onto, is that "peak Google is done for" has been wrong every single time — Google tends to answer doubters with a model. The signal to track is concrete and near: does Gemini 3.5 Pro actually ship on June 30, and does it close the gap on the agentic, coding-heavy enterprise work where Google has fallen behind? A third slip turns a narrative into a fact; a strong release erases it.</w:t>
+        <w:t xml:space="preserve"> Weigh this as a genuine narrative shift, not a verdict. The honest counter worth holding onto is that "peak Google is done for" has been wrong every single time — Google tends to answer doubters with a model. The signal to track is concrete and near: does Gemini 3.5 Pro actually ship on June 30, and does it close the gap on the agentic, coding-heavy enterprise work where Google has fallen behind? A third slip turns a narrative into a fact; a strong release erases it.</w:t>
       </w:r>
     </w:p>
     <w:p>
@@ -350,7 +350,7 @@
         <w:pStyle w:val="Heading2"/>
       </w:pPr>
       <w:r>
-        <w:t>3. Nadella's "token capital" essay: your company doesn't need an AI strategy, it needs a learning system it owns.</w:t>
+        <w:t>3. Nadella's "token capital" essay: a company doesn't need an AI strategy, it needs a learning system it owns.</w:t>
       </w:r>
     </w:p>
     <w:p>
@@ -361,7 +361,7 @@
         <w:t>What happened.</w:t>
       </w:r>
       <w:r>
-        <w:t xml:space="preserve"> Satya Nadella published an essay, "A Frontier Without an Ecosystem Is Not Stable," that went viral (tens of millions of views) and became the week's central argument. Its claim: the real asset is not which model you license — those are increasingly commodities that can absorb and commoditize your expertise — but the compounding loop you build on top of one.</w:t>
+        <w:t xml:space="preserve"> Satya Nadella published an essay, "A Frontier Without an Ecosystem Is Not Stable," that went viral (tens of millions of views) and became the week's central argument. Its claim: the real asset is not which model a company licenses — those are increasingly commodities that can absorb and commoditize its expertise — but the compounding loop built on top of one.</w:t>
       </w:r>
     </w:p>
     <w:p>
@@ -380,7 +380,7 @@
         <w:rPr>
           <w:b/>
         </w:rPr>
-        <w:t>Why it matters to me, traced out.</w:t>
+        <w:t>Why it matters.</w:t>
       </w:r>
     </w:p>
     <w:p>
@@ -416,10 +416,10 @@
         <w:rPr>
           <w:b/>
         </w:rPr>
-        <w:t>My read.</w:t>
+        <w:t>The take.</w:t>
       </w:r>
       <w:r>
-        <w:t xml:space="preserve"> This is the clearest answer going to "how do I make AI a durable advantage and not just a line item." Read the self-interest too: Nadella is declaring independence from his partners-turned-rivals OpenAI and Anthropic, and selling Microsoft's own "Frontier Tuning" product (launched at Build on June 2). But the framework stands on its own, and it's the one I'd hand to anyone bringing AI into a business.</w:t>
+        <w:t xml:space="preserve"> This is the clearest answer going to "how do I make AI a durable advantage and not just a line item." Read the self-interest too: Nadella is declaring independence from his partners-turned-rivals OpenAI and Anthropic, and selling Microsoft's own "Frontier Tuning" product (launched at Build on June 2). But the framework stands on its own, and it's the one to hand to anyone bringing AI into a business.</w:t>
       </w:r>
     </w:p>
     <w:p>
@@ -514,7 +514,7 @@
         <w:rPr>
           <w:b/>
         </w:rPr>
-        <w:t>Why it matters to me, traced out.</w:t>
+        <w:t>Why it matters.</w:t>
       </w:r>
     </w:p>
     <w:p>
@@ -564,7 +564,7 @@
         <w:rPr>
           <w:b/>
         </w:rPr>
-        <w:t>My read.</w:t>
+        <w:t>The take.</w:t>
       </w:r>
       <w:r>
         <w:t xml:space="preserve"> The thaw looks real, and the framework is the thing to watch, not the day-to-day quotes. One caution, flagged: GPT-5.5 Cyber's "beats Mythos" claim (85.6% vs 83.8% on the CyberGym benchmark) is OpenAI's own framing, landing while Mythos is forced offline and can't answer — not an independent head-to-head, so discount it accordingly.</w:t>
@@ -694,7 +694,7 @@
         <w:rPr>
           <w:b/>
         </w:rPr>
-        <w:t>Why it matters to me, traced out.</w:t>
+        <w:t>Why it matters.</w:t>
       </w:r>
     </w:p>
     <w:p>
@@ -730,10 +730,10 @@
         <w:rPr>
           <w:b/>
         </w:rPr>
-        <w:t>My read.</w:t>
+        <w:t>The take.</w:t>
       </w:r>
       <w:r>
-        <w:t xml:space="preserve"> For someone building toward deals in this space, this is the regulatory tail risk worth tracking: equity taxes, forced government stakes, and windfall levies are now inside the Overton window. Not imminent, but no longer fringe — the kind of thing that can reprice a whole sector if it gains momentum into an election.</w:t>
+        <w:t xml:space="preserve"> For an operator building toward deals in this space, this is the regulatory tail risk worth tracking: equity taxes, forced government stakes, and windfall levies are now inside the Overton window. Not imminent, but no longer fringe — the kind of thing that can reprice a whole sector if it gains momentum into an election.</w:t>
       </w:r>
     </w:p>
     <w:p>
@@ -958,7 +958,7 @@
           <w:b/>
           <w:color w:val="0F766E"/>
         </w:rPr>
-        <w:t>Finance-tangential, worth your eye:</w:t>
+        <w:t>Finance-tangential, worth a look:</w:t>
       </w:r>
       <w:r>
         <w:t xml:space="preserve"> Coinbase launched pre-IPO perpetual futures (ANTHROPIC-PERP, OPENAI-PERP) around June 22, letting traders take synthetic positions on still-private labs. Exactly the "manufacture exposure to a private asset" instrument that shows up late in a cycle — understand it, be wary of it. </w:t>
@@ -983,7 +983,7 @@
     </w:p>
     <w:p>
       <w:r>
-        <w:t>The perspective layer — the podcasts and analysts I read for the arguments behind the week's events.</w:t>
+        <w:t>The perspective layer — the podcasts and analysts followed for the arguments behind the week's events.</w:t>
       </w:r>
     </w:p>
     <w:p>
@@ -1033,7 +1033,7 @@
         <w:t>Why it matters:</w:t>
       </w:r>
       <w:r>
-        <w:t xml:space="preserve"> two things land for you. First, his pricing argument is a real operator insight — Snowflake's consumption model (pay per use, not per seat) is genuinely better aligned to bursty agent workloads than seat-based SaaS, which is a tell about how AI breaks the SaaS pricing playbook. Second, his aside that GDPR is a net negative for European startups because compliance cost entrenches incumbents is the kind of regulation-as-moat point that matters when you're sizing up where to build. </w:t>
+        <w:t xml:space="preserve"> two things land. First, his pricing argument is a real operator insight — Snowflake's consumption model (pay per use, not per seat) is genuinely better aligned to bursty agent workloads than seat-based SaaS, which is a tell about how AI breaks the SaaS pricing playbook. Second, his aside that GDPR is a net negative for European startups because compliance cost entrenches incumbents is the kind of regulation-as-moat point that matters when sizing up where to build. </w:t>
       </w:r>
       <w:hyperlink r:id="rId27">
         <w:r>
@@ -1115,7 +1115,7 @@
         <w:t>Why it matters:</w:t>
       </w:r>
       <w:r>
-        <w:t xml:space="preserve"> Clark's reframe is the keeper — "don't think you're buying a technology, think you're employing thousands of people with the access of a chief of staff to the CEO." And his read on hiring is directly relevant to how you'd staff a company: it's going barbell, more senior people (experience compounds with AI) plus AI-native juniors, with the middle squeezed. </w:t>
+        <w:t xml:space="preserve"> Clark's reframe is the keeper — "don't think you're buying a technology, think you're employing thousands of people with the access of a chief of staff to the CEO." And his read on hiring is directly relevant to how to staff a company: it's going barbell, more senior people (experience compounds with AI) plus AI-native juniors, with the middle squeezed. </w:t>
       </w:r>
       <w:hyperlink r:id="rId29">
         <w:r>
@@ -1247,7 +1247,7 @@
         <w:t>Why it matters:</w:t>
       </w:r>
       <w:r>
-        <w:t xml:space="preserve"> it's the cleanest framing of the bubble-vs-breakthrough fork, and the "no instant verifier in law" point is exactly why professional-services AI is harder than coding AI — useful when you're judging which AI businesses are real. </w:t>
+        <w:t xml:space="preserve"> it's the cleanest framing of the bubble-vs-breakthrough fork, and the "no instant verifier in law" point is exactly why professional-services AI is harder than coding AI — useful when judging which AI businesses are real. </w:t>
       </w:r>
       <w:hyperlink r:id="rId32">
         <w:r>
@@ -1288,7 +1288,7 @@
         <w:t>Why it matters:</w:t>
       </w:r>
       <w:r>
-        <w:t xml:space="preserve"> it's directly useful for you as a future operator who'll have to build a public narrative — and "you want people to hate you and love you, never lukewarm" is a sharper articulation of brand-building than most VC content. </w:t>
+        <w:t xml:space="preserve"> it's directly useful for any future operator who'll have to build a public narrative — and "you want people to hate you and love you, never lukewarm" is a sharper articulation of brand-building than most VC content. </w:t>
       </w:r>
       <w:hyperlink r:id="rId33">
         <w:r>
@@ -1384,7 +1384,7 @@
         <w:t>Why it matters:</w:t>
       </w:r>
       <w:r>
-        <w:t xml:space="preserve"> it's the sharpest articulation of the week's biggest structural shift, and the pointed irony — GLM rivals the exact Fable 5 capability the US just banned, yet is freely downloadable — is the kind of contradiction that drives the policy fights you'll want to track. </w:t>
+        <w:t xml:space="preserve"> it's the sharpest articulation of the week's biggest structural shift, and the pointed irony — GLM rivals the exact Fable 5 capability the US just banned, yet is freely downloadable — is the kind of contradiction that drives the policy fights worth tracking. </w:t>
       </w:r>
       <w:hyperlink r:id="rId35">
         <w:r>
@@ -1603,7 +1603,7 @@
     </w:p>
     <w:p>
       <w:r>
-        <w:t>(The Diff's in-window issue, "The Megacap Era," was fully paywalled, so I could not pull its argument this week; One Useful Thing had no in-window post.)</w:t>
+        <w:t>(The Diff's in-window issue, "The Megacap Era," was fully paywalled, so its argument could not be pulled this week; One Useful Thing had no in-window post.)</w:t>
       </w:r>
     </w:p>
     <w:p>
@@ -1616,7 +1616,7 @@
     </w:p>
     <w:p>
       <w:r>
-        <w:t>Each week I scout beyond the baseline list for new high-signal sources — Substacks, podcasts, YouTube channels, analysts — and surface the best finds here for you to bless or pass on. The ones you like get promoted into the standing rotation.</w:t>
+        <w:t>Each week, beyond the baseline list, new high-signal sources are scouted — Substacks, podcasts, YouTube channels, analysts — and the best finds surfaced here with a recommendation to add or pass. Blessed sources get promoted into the standing rotation.</w:t>
       </w:r>
     </w:p>
     <w:p>
@@ -1645,10 +1645,10 @@
           <w:b/>
           <w:color w:val="0F766E"/>
         </w:rPr>
-        <w:t>Why it fits you:</w:t>
+        <w:t>Why it fits:</w:t>
       </w:r>
       <w:r>
-        <w:t xml:space="preserve"> it sits dead-center on your finance-plus-infrastructure interests and the new "models and their specs" beat — it follows the money and the supply chain, not the hype. This week alone it ran "Stop Saying Half of 2026 US Datacenter Capacity Is Canceled" (June 23) and "CPUs are Back: The Datacenter CPU Landscape in 2026," the latter independently confirming the exact CPU-demand shift Intel's Lip-Bu Tan described on No Priors above. That kind of corroboration from a money-and-engineering lens is exactly what's been missing.</w:t>
+        <w:t xml:space="preserve"> it sits dead-center on the finance-plus-infrastructure beat and the new "models and their specs" beat — it follows the money and the supply chain, not the hype. This week alone it ran "Stop Saying Half of 2026 US Datacenter Capacity Is Canceled" (June 23) and "CPUs are Back: The Datacenter CPU Landscape in 2026," the latter independently confirming the exact CPU-demand shift Intel's Lip-Bu Tan described on No Priors above. That kind of corroboration from a money-and-engineering lens is exactly what's been missing.</w:t>
       </w:r>
     </w:p>
     <w:p>
@@ -1657,7 +1657,7 @@
           <w:b/>
           <w:color w:val="0F766E"/>
         </w:rPr>
-        <w:t>My recommendation:</w:t>
+        <w:t>The recommendation:</w:t>
       </w:r>
       <w:r>
         <w:t xml:space="preserve"> add it to the standing rotation. It's paywalled in part, but its free posts and summaries are substantial. </w:t>
@@ -1803,7 +1803,7 @@
         <w:t>Could not reach:</w:t>
       </w:r>
       <w:r>
-        <w:t xml:space="preserve"> One Useful Thing (Ethan Mollick) had no in-window post, and The Diff's in-window issue was fully paywalled. WSJ articles are cited from search snippets where they came up (full text is paywalled); the WSJ What's News podcast, FT News Briefing, and Bloomberg Talks have been dropped from the weekly scan.</w:t>
+        <w:t xml:space="preserve"> One Useful Thing (Ethan Mollick) had no in-window post, and The Diff's in-window issue was fully paywalled. WSJ articles are cited from search snippets where they come up (full text is paywalled); the WSJ What's News podcast, FT News Briefing, and Bloomberg Talks have been dropped from the weekly scan.</w:t>
       </w:r>
     </w:p>
     <w:p>

</xml_diff>

<commit_message>
Editorial beat label: 'The take' -> 'My take'
Per Matthew: keep the editorial beat in the writer's first-person voice
('My take'), since it is the writer's opinion and not addressed to any
one reader. Everything else stays personalized to Matthew; only the
brief's mode of address goes neutral.

Co-Authored-By: Claude Opus 4.8 <noreply@anthropic.com>
Claude-Session: https://claude.ai/code/session_01BdkwahKEQkSri93kBHfX4o
</commit_message>
<xml_diff>
--- a/templates/ai-pulse-format-reference.docx
+++ b/templates/ai-pulse-format-reference.docx
@@ -116,7 +116,7 @@
         <w:rPr>
           <w:b/>
         </w:rPr>
-        <w:t>The take.</w:t>
+        <w:t>My take.</w:t>
       </w:r>
       <w:r>
         <w:t xml:space="preserve"> This is the most important model story of the week, and the signal is real rather than hype — the staying power past the usual two-week fade is exactly what's new. The operator move is not to panic-buy the ~$400K of Nvidia H200s needed to run it locally; it's to give one corner of the org a sandbox and a router (like OpenRouter) and build the routing muscle, because that muscle is the durable skill no matter which model wins.</w:t>
@@ -250,7 +250,7 @@
         <w:rPr>
           <w:b/>
         </w:rPr>
-        <w:t>The take.</w:t>
+        <w:t>My take.</w:t>
       </w:r>
       <w:r>
         <w:t xml:space="preserve"> Weigh this as a genuine narrative shift, not a verdict. The honest counter worth holding onto is that "peak Google is done for" has been wrong every single time — Google tends to answer doubters with a model. The signal to track is concrete and near: does Gemini 3.5 Pro actually ship on June 30, and does it close the gap on the agentic, coding-heavy enterprise work where Google has fallen behind? A third slip turns a narrative into a fact; a strong release erases it.</w:t>
@@ -416,7 +416,7 @@
         <w:rPr>
           <w:b/>
         </w:rPr>
-        <w:t>The take.</w:t>
+        <w:t>My take.</w:t>
       </w:r>
       <w:r>
         <w:t xml:space="preserve"> This is the clearest answer going to "how do I make AI a durable advantage and not just a line item." Read the self-interest too: Nadella is declaring independence from his partners-turned-rivals OpenAI and Anthropic, and selling Microsoft's own "Frontier Tuning" product (launched at Build on June 2). But the framework stands on its own, and it's the one to hand to anyone bringing AI into a business.</w:t>
@@ -564,7 +564,7 @@
         <w:rPr>
           <w:b/>
         </w:rPr>
-        <w:t>The take.</w:t>
+        <w:t>My take.</w:t>
       </w:r>
       <w:r>
         <w:t xml:space="preserve"> The thaw looks real, and the framework is the thing to watch, not the day-to-day quotes. One caution, flagged: GPT-5.5 Cyber's "beats Mythos" claim (85.6% vs 83.8% on the CyberGym benchmark) is OpenAI's own framing, landing while Mythos is forced offline and can't answer — not an independent head-to-head, so discount it accordingly.</w:t>
@@ -730,7 +730,7 @@
         <w:rPr>
           <w:b/>
         </w:rPr>
-        <w:t>The take.</w:t>
+        <w:t>My take.</w:t>
       </w:r>
       <w:r>
         <w:t xml:space="preserve"> For an operator building toward deals in this space, this is the regulatory tail risk worth tracking: equity taxes, forced government stakes, and windfall levies are now inside the Overton window. Not imminent, but no longer fringe — the kind of thing that can reprice a whole sector if it gains momentum into an election.</w:t>

</xml_diff>

<commit_message>
Readability: break long beats into shorter paragraphs
Add a 'keep paragraphs short' rule to topics/ai-pulse.md (a beat may be
several paragraphs; split long prose at natural seams, first paragraph
keeps the bold label). Apply it to the example brief — item 1 What
happened -> 3 paras, items 2/3/4/5 long beats split into 2-3. Regenerate
docx; refresh sandbox mirror.

Co-Authored-By: Claude Opus 4.8 <noreply@anthropic.com>
Claude-Session: https://claude.ai/code/session_01BdkwahKEQkSri93kBHfX4o
</commit_message>
<xml_diff>
--- a/templates/ai-pulse-format-reference.docx
+++ b/templates/ai-pulse-format-reference.docx
@@ -47,7 +47,17 @@
         <w:t>What happened.</w:t>
       </w:r>
       <w:r>
-        <w:t xml:space="preserve"> Z.ai's GLM 5.2 — an open-weight model, meaning its trained parameters (the model's internal dials, a rough proxy for how much it has absorbed and how much hardware it needs to run) are downloadable, so anyone with the hardware runs it themselves instead of renting it through an API — shipped June 16. Unlike every prior Chinese release, it did not fade after the first benchmark buzz: after a weekend of heavy hands-on use, respected builders (Vercel's Guillermo Rauch, people at Together AI) were still raving, and on Design Arena — a leaderboard where people are shown two models' web pages side by side and vote on the better one — it now ranks first in the world for website design, ahead of Anthropic's Fable 5. The benchmark names need glossing, since they carry the story. SWE-bench Pro is a standardized test of real software work: the model is handed actual open-source bug reports from GitHub and graded on whether its code fix makes the project's own tests pass — so the score is just the percentage of real coding tasks it solved end to end. GLM 5.2 scored 62.1 (about 62% solved) against GPT-5.5's 58.6, and on a harder version called FrontierSWE it came within about a point of Opus 4.8, Anthropic's flagship — meaning a free, downloadable Chinese model is now within a hair of the best paid model in the world on the coding work these tools are actually hired for. A few other specs that carry weight: a 1M-token "context window" (it can hold roughly 750,000 words in working memory at once, so it can read a whole codebase before answering), an MIT license (free to use commercially), and pricing roughly 3.6x cheaper on input and 5.7x cheaper on output than Opus.</w:t>
+        <w:t xml:space="preserve"> Z.ai's GLM 5.2 — an open-weight model, meaning its trained parameters (the model's internal dials, a rough proxy for how much it has absorbed and how much hardware it needs to run) are downloadable, so anyone with the hardware runs it themselves instead of renting it through an API — shipped June 16. Unlike every prior Chinese release, it did not fade after the first benchmark buzz: after a weekend of heavy hands-on use, respected builders (Vercel's Guillermo Rauch, people at Together AI) were still raving, and on Design Arena — a leaderboard where people are shown two models' web pages side by side and vote on the better one — it now ranks first in the world for website design, ahead of Anthropic's Fable 5.</w:t>
+      </w:r>
+    </w:p>
+    <w:p>
+      <w:r>
+        <w:t>The benchmark names need glossing, since they carry the story. SWE-bench Pro is a standardized test of real software work: the model is handed actual open-source bug reports from GitHub and graded on whether its code fix makes the project's own tests pass — so the score is just the percentage of real coding tasks it solved end to end. GLM 5.2 scored 62.1 (about 62% solved) against GPT-5.5's 58.6, and on a harder version called FrontierSWE it came within about a point of Opus 4.8, Anthropic's flagship — meaning a free, downloadable Chinese model is now within a hair of the best paid model in the world on the coding work these tools are actually hired for.</w:t>
+      </w:r>
+    </w:p>
+    <w:p>
+      <w:r>
+        <w:t>A few other specs that carry weight: a 1M-token "context window" (it can hold roughly 750,000 words in working memory at once, so it can read a whole codebase before answering), an MIT license (free to use commercially), and pricing roughly 3.6x cheaper on input and 5.7x cheaper on output than Opus.</w:t>
       </w:r>
     </w:p>
     <w:p>
@@ -181,7 +191,12 @@
         <w:t>What happened.</w:t>
       </w:r>
       <w:r>
-        <w:t xml:space="preserve"> In one week, Google DeepMind lost two of the biggest names in AI, and the market repriced the loss in real time. Noam Shazeer — co-author of the foundational "Attention Is All You Need" paper, whom Google paid $2.7B to re-acquire less than two years ago to help run Gemini — left for OpenAI (June 18). Then John Jumper, the AlphaFold creator who shared the 2024 Nobel Prize in Chemistry, left for Anthropic (June 19). Alphabet stock fell as much as ~7% on Monday June 22, its biggest intraday move since February, erasing somewhere around $200–250B in value depending on the source. Meanwhile Gemini 3.5 Pro, promised "next month" back at I/O in May, has reportedly slipped to a June 30 target, with one internal source calling it "not the step change we need."</w:t>
+        <w:t xml:space="preserve"> In one week, Google DeepMind lost two of the biggest names in AI. Noam Shazeer — co-author of the foundational "Attention Is All You Need" paper, whom Google paid $2.7B to re-acquire less than two years ago to help run Gemini — left for OpenAI (June 18). Then John Jumper, the AlphaFold creator who shared the 2024 Nobel Prize in Chemistry, left for Anthropic (June 19).</w:t>
+      </w:r>
+    </w:p>
+    <w:p>
+      <w:r>
+        <w:t>The market repriced the loss in real time. Alphabet stock fell as much as ~7% on Monday June 22, its biggest intraday move since February, erasing somewhere around $200–250B in value depending on the source. Meanwhile Gemini 3.5 Pro, promised "next month" back at I/O in May, has reportedly slipped to a June 30 target, with one internal source calling it "not the step change we need."</w:t>
       </w:r>
     </w:p>
     <w:p>
@@ -375,7 +390,17 @@
         <w:t>What happened.</w:t>
       </w:r>
       <w:r>
-        <w:t xml:space="preserve"> Satya Nadella published an essay, "A Frontier Without an Ecosystem Is Not Stable," that went viral (tens of millions of views) and became the week's central argument. Its claim: the real asset is not which model a company licenses — those are increasingly commodities that can absorb and commoditize its expertise — but the compounding loop built on top of one. He frames it as two balance-sheet items: "human capital" (people's knowledge, judgment, relationships, pattern recognition) and "token capital" (the AI capability a firm builds and owns); a commenter distilled it as token capital = human capital × scaffolding × feedback loops, where any zero zeroes the whole thing. The prescription is concrete: private evals that measure real business outcomes (not public benchmarks), private "RL environments" (training setups where an agent practices a firm's specific workflow and gets scored, so it improves on those processes rather than generic ones), and a queryable knowledge base — together a "hill-climbing machine" where every improved workflow generates better training signal. His warning, in his words: "There is no societal permission for an AI future that hollows out entire industries."</w:t>
+        <w:t xml:space="preserve"> Satya Nadella published an essay, "A Frontier Without an Ecosystem Is Not Stable," that went viral (tens of millions of views) and became the week's central argument. Its claim: the real asset is not which model a company licenses — those are increasingly commodities that can absorb and commoditize its expertise — but the compounding loop built on top of one.</w:t>
+      </w:r>
+    </w:p>
+    <w:p>
+      <w:r>
+        <w:t>He frames it as two balance-sheet items: "human capital" (people's knowledge, judgment, relationships, pattern recognition) and "token capital" (the AI capability a firm builds and owns); a commenter distilled it as token capital = human capital × scaffolding × feedback loops, where any zero zeroes the whole thing.</w:t>
+      </w:r>
+    </w:p>
+    <w:p>
+      <w:r>
+        <w:t>The prescription is concrete: private evals that measure real business outcomes (not public benchmarks), private "RL environments" (training setups where an agent practices a firm's specific workflow and gets scored, so it improves on those processes rather than generic ones), and a queryable knowledge base — together a "hill-climbing machine" where every improved workflow generates better training signal. His warning, in his words: "There is no societal permission for an AI future that hollows out entire industries."</w:t>
       </w:r>
     </w:p>
     <w:p>
@@ -509,7 +534,12 @@
         <w:t>Does it hold up?</w:t>
       </w:r>
       <w:r>
-        <w:t xml:space="preserve"> Two of the loudest claims around the story do not survive scrutiny. First, the viral line that Anthropic's Mythos cyber model had broken into nearly all of the NSA's classified systems "not in weeks, but in hours" collapsed: the Economist reporter who wrote it issued a correction — Senator Warner had misread the NSA director, and the episode was a controlled internal red-team exercise, not a live breach. Second, OpenAI's GPT-5.5 Cyber "beats Mythos" claim (85.6% vs 83.8% on the CyberGym benchmark) is OpenAI's own framing, landing while Mythos is forced offline and can't answer — not an independent head-to-head, so discount it accordingly.</w:t>
+        <w:t xml:space="preserve"> Two of the loudest claims around the story do not survive scrutiny.</w:t>
+      </w:r>
+    </w:p>
+    <w:p>
+      <w:r>
+        <w:t>First, the viral line that Anthropic's Mythos cyber model had broken into nearly all of the NSA's classified systems "not in weeks, but in hours" collapsed: the Economist reporter who wrote it issued a correction — Senator Warner had misread the NSA director, and the episode was a controlled internal red-team exercise, not a live breach. Second, OpenAI's GPT-5.5 Cyber "beats Mythos" claim (85.6% vs 83.8% on the CyberGym benchmark) is OpenAI's own framing, landing while Mythos is forced offline and can't answer — not an independent head-to-head, so discount it accordingly.</w:t>
       </w:r>
     </w:p>
     <w:p>
@@ -678,7 +708,12 @@
         <w:t>What happened.</w:t>
       </w:r>
       <w:r>
-        <w:t xml:space="preserve"> Senator Sanders introduced the American AI Sovereign Wealth Fund Act (June 18): a fund — larger than the Social Security Trust Fund — financed by a one-time 50% tax on the equity of any company with more than $200M in annual AI sales, with the government holding voting shares and paying every American an annual dividend of more than $1,000. The bill text is on Sanders's own Senate page; it pegs the fund near $7 trillion at current valuations and creates an "Independent Commission for Democratic AI." Read literally, a 50% voting stake in every large AI company amounts to de facto government control of the sector.</w:t>
+        <w:t xml:space="preserve"> Senator Sanders introduced the American AI Sovereign Wealth Fund Act (June 18): a fund — larger than the Social Security Trust Fund — financed by a one-time 50% tax on the equity of any company with more than $200M in annual AI sales, with the government holding voting shares and paying every American an annual dividend of more than $1,000.</w:t>
+      </w:r>
+    </w:p>
+    <w:p>
+      <w:r>
+        <w:t>The bill text is on Sanders's own Senate page; it pegs the fund near $7 trillion at current valuations and creates an "Independent Commission for Democratic AI." Read literally, a 50% voting stake in every large AI company amounts to de facto government control of the sector.</w:t>
       </w:r>
     </w:p>
     <w:p>

</xml_diff>

<commit_message>
Precedence: MEMORY always wins; never block the brief; report contradictions at the bottom
Per Matthew, simplify and harden the conflict rule so the brief always sends:
- CLAUDE.md precedence rewritten: MEMORY.md ALWAYS takes precedence over
  everything (CLAUDE + topics included). A contradiction never blocks/delays
  the brief — apply MEMORY's side, finish, and report it at the bottom; major
  ones flagged for later out-of-band fixing.
- topics/ai-pulse.md: add a closing 'Config notes' output item — the brief's
  last line reports whether any config contradiction turned up and how it was
  resolved (MEMORY wins); report-only, never blocks.
- skill Step 1 pointer updated to match (MEMORY always wins, never block, note
  at the bottom).
- format reference: add the 'Config notes' closing line + regenerate docx.

Co-Authored-By: Claude Opus 4.8 <noreply@anthropic.com>
Claude-Session: https://claude.ai/code/session_01BdkwahKEQkSri93kBHfX4o
</commit_message>
<xml_diff>
--- a/templates/ai-pulse-format-reference.docx
+++ b/templates/ai-pulse-format-reference.docx
@@ -1845,6 +1845,26 @@
         <w:t xml:space="preserve"> GLM 5.2's release (June 16), the SpaceX–Cursor deal (June 16), and the Nadella essay's posting (June 14) originate just before the window; carried only for their in-window follow-on.</w:t>
       </w:r>
     </w:p>
+    <w:p>
+      <w:pPr>
+        <w:pStyle w:val="Heading1"/>
+      </w:pPr>
+      <w:r>
+        <w:t>Config notes</w:t>
+      </w:r>
+    </w:p>
+    <w:p>
+      <w:r>
+        <w:rPr>
+          <w:b/>
+          <w:color w:val="0F766E"/>
+        </w:rPr>
+        <w:t>Config notes:</w:t>
+      </w:r>
+      <w:r>
+        <w:t xml:space="preserve"> no contradictions this run — CLAUDE.md, the topic config, and MEMORY.md were consistent.</w:t>
+      </w:r>
+    </w:p>
     <w:sectPr>
       <w:pgSz w:w="12240" w:h="15840"/>
       <w:pgMar w:top="1440" w:right="1440" w:bottom="1440" w:left="1440" w:header="720" w:footer="720" w:gutter="0"/>

</xml_diff>